<commit_message>
dodav perevirky na null
</commit_message>
<xml_diff>
--- a/TP-KB-251-Ilia-Prokhorenko-lpr.docx
+++ b/TP-KB-251-Ilia-Prokhorenko-lpr.docx
@@ -3218,12 +3218,34 @@
           <w:lang w:val="ru-RU"/>
         </w:rPr>
       </w:pPr>
+      <w:proofErr w:type="spellStart"/>
       <w:r>
         <w:rPr>
           <w:lang w:val="ru-RU"/>
         </w:rPr>
         <w:lastRenderedPageBreak/>
-        <w:t xml:space="preserve">Виведення повідомлення про </w:t>
+        <w:t>Виведення</w:t>
+      </w:r>
+      <w:proofErr w:type="spellEnd"/>
+      <w:r>
+        <w:rPr>
+          <w:lang w:val="ru-RU"/>
+        </w:rPr>
+        <w:t xml:space="preserve"> </w:t>
+      </w:r>
+      <w:proofErr w:type="spellStart"/>
+      <w:r>
+        <w:rPr>
+          <w:lang w:val="ru-RU"/>
+        </w:rPr>
+        <w:t>повідомлення</w:t>
+      </w:r>
+      <w:proofErr w:type="spellEnd"/>
+      <w:r>
+        <w:rPr>
+          <w:lang w:val="ru-RU"/>
+        </w:rPr>
+        <w:t xml:space="preserve"> про </w:t>
       </w:r>
       <w:proofErr w:type="spellStart"/>
       <w:r>
@@ -3932,31 +3954,49 @@
     <w:p>
       <w:pPr>
         <w:ind w:firstLine="0"/>
+        <w:rPr>
+          <w:lang w:val="ru-RU"/>
+        </w:rPr>
       </w:pPr>
     </w:p>
     <w:p>
       <w:pPr>
         <w:ind w:firstLine="0"/>
+        <w:rPr>
+          <w:lang w:val="ru-RU"/>
+        </w:rPr>
       </w:pPr>
     </w:p>
     <w:p>
       <w:pPr>
         <w:ind w:firstLine="0"/>
+        <w:rPr>
+          <w:lang w:val="ru-RU"/>
+        </w:rPr>
       </w:pPr>
     </w:p>
     <w:p>
       <w:pPr>
         <w:ind w:firstLine="0"/>
+        <w:rPr>
+          <w:lang w:val="ru-RU"/>
+        </w:rPr>
       </w:pPr>
     </w:p>
     <w:p>
       <w:pPr>
         <w:ind w:firstLine="0"/>
+        <w:rPr>
+          <w:lang w:val="ru-RU"/>
+        </w:rPr>
       </w:pPr>
     </w:p>
     <w:p>
       <w:pPr>
         <w:ind w:firstLine="0"/>
+        <w:rPr>
+          <w:lang w:val="ru-RU"/>
+        </w:rPr>
       </w:pPr>
       <w:r>
         <w:rPr>
@@ -4066,19 +4106,7 @@
         <w:rPr>
           <w:lang w:val="uk-UA"/>
         </w:rPr>
-        <w:t>Під час виконання практичного завдання до Теми №</w:t>
-      </w:r>
-      <w:r>
-        <w:rPr>
-          <w:lang w:val="uk-UA"/>
-        </w:rPr>
-        <w:t>2</w:t>
-      </w:r>
-      <w:r>
-        <w:rPr>
-          <w:lang w:val="uk-UA"/>
-        </w:rPr>
-        <w:t xml:space="preserve"> було надано варіанти рішення до наступних задач:</w:t>
+        <w:t>Під час виконання практичного завдання до Теми №2 було надано варіанти рішення до наступних задач:</w:t>
       </w:r>
     </w:p>
     <w:p>
@@ -4097,15 +4125,7 @@
           <w:bCs/>
           <w:lang w:val="uk-UA"/>
         </w:rPr>
-        <w:t xml:space="preserve">1. </w:t>
-      </w:r>
-      <w:r>
-        <w:rPr>
-          <w:b/>
-          <w:bCs/>
-          <w:lang w:val="uk-UA"/>
-        </w:rPr>
-        <w:t>Функція пошуку коренів дискримінанту</w:t>
+        <w:t>1. Функція пошуку коренів дискримінанту</w:t>
       </w:r>
     </w:p>
     <w:p>
@@ -5407,11 +5427,6 @@
           <w:lang w:val="uk-UA"/>
         </w:rPr>
         <w:tab/>
-      </w:r>
-      <w:r>
-        <w:rPr>
-          <w:lang w:val="uk-UA"/>
-        </w:rPr>
         <w:t xml:space="preserve">Посилання на </w:t>
       </w:r>
       <w:proofErr w:type="spellStart"/>
@@ -5636,25 +5651,7 @@
             <w:szCs w:val="24"/>
             <w:lang w:val="uk-UA"/>
           </w:rPr>
-          <w:t>_0</w:t>
-        </w:r>
-        <w:r>
-          <w:rPr>
-            <w:rStyle w:val="a5"/>
-            <w:sz w:val="24"/>
-            <w:szCs w:val="24"/>
-            <w:lang w:val="uk-UA"/>
-          </w:rPr>
-          <w:t>2</w:t>
-        </w:r>
-        <w:r>
-          <w:rPr>
-            <w:rStyle w:val="a5"/>
-            <w:sz w:val="24"/>
-            <w:szCs w:val="24"/>
-            <w:lang w:val="uk-UA"/>
-          </w:rPr>
-          <w:t>/</w:t>
+          <w:t>_02/</w:t>
         </w:r>
         <w:r>
           <w:rPr>
@@ -5672,16 +5669,7 @@
             <w:szCs w:val="24"/>
             <w:lang w:val="uk-UA"/>
           </w:rPr>
-          <w:t>1</w:t>
-        </w:r>
-        <w:r>
-          <w:rPr>
-            <w:rStyle w:val="a5"/>
-            <w:sz w:val="24"/>
-            <w:szCs w:val="24"/>
-            <w:lang w:val="uk-UA"/>
-          </w:rPr>
-          <w:t>.</w:t>
+          <w:t>1.</w:t>
         </w:r>
         <w:proofErr w:type="spellStart"/>
         <w:r>
@@ -5737,6 +5725,7 @@
       </w:pPr>
       <w:r>
         <w:rPr>
+          <w:noProof/>
           <w:lang w:val="ru-RU"/>
         </w:rPr>
         <w:drawing>
@@ -5791,23 +5780,7 @@
           <w:bCs/>
           <w:lang w:val="uk-UA"/>
         </w:rPr>
-        <w:t>2</w:t>
-      </w:r>
-      <w:r>
-        <w:rPr>
-          <w:b/>
-          <w:bCs/>
-          <w:lang w:val="uk-UA"/>
-        </w:rPr>
-        <w:t xml:space="preserve">. </w:t>
-      </w:r>
-      <w:r>
-        <w:rPr>
-          <w:b/>
-          <w:bCs/>
-          <w:lang w:val="uk-UA"/>
-        </w:rPr>
-        <w:t xml:space="preserve">Калькулятор </w:t>
+        <w:t xml:space="preserve">2. Калькулятор </w:t>
       </w:r>
       <w:r>
         <w:rPr>
@@ -6659,6 +6632,66 @@
                 <w:szCs w:val="20"/>
                 <w:lang w:val="uk-UA"/>
               </w:rPr>
+              <w:t xml:space="preserve">    if b == 0:</w:t>
+            </w:r>
+          </w:p>
+          <w:p>
+            <w:pPr>
+              <w:ind w:firstLine="0"/>
+              <w:rPr>
+                <w:rFonts w:ascii="Courier New" w:hAnsi="Courier New" w:cs="Courier New"/>
+                <w:sz w:val="20"/>
+                <w:szCs w:val="20"/>
+                <w:lang w:val="uk-UA"/>
+              </w:rPr>
+            </w:pPr>
+            <w:r>
+              <w:rPr>
+                <w:rFonts w:ascii="Courier New" w:hAnsi="Courier New" w:cs="Courier New"/>
+                <w:sz w:val="20"/>
+                <w:szCs w:val="20"/>
+                <w:lang w:val="uk-UA"/>
+              </w:rPr>
+              <w:t xml:space="preserve">        </w:t>
+            </w:r>
+            <w:proofErr w:type="spellStart"/>
+            <w:r>
+              <w:rPr>
+                <w:rFonts w:ascii="Courier New" w:hAnsi="Courier New" w:cs="Courier New"/>
+                <w:sz w:val="20"/>
+                <w:szCs w:val="20"/>
+                <w:lang w:val="uk-UA"/>
+              </w:rPr>
+              <w:t>return</w:t>
+            </w:r>
+            <w:proofErr w:type="spellEnd"/>
+            <w:r>
+              <w:rPr>
+                <w:rFonts w:ascii="Courier New" w:hAnsi="Courier New" w:cs="Courier New"/>
+                <w:sz w:val="20"/>
+                <w:szCs w:val="20"/>
+                <w:lang w:val="uk-UA"/>
+              </w:rPr>
+              <w:t xml:space="preserve"> "Помилка: ділення на нуль неможливе!"</w:t>
+            </w:r>
+          </w:p>
+          <w:p>
+            <w:pPr>
+              <w:ind w:firstLine="0"/>
+              <w:rPr>
+                <w:rFonts w:ascii="Courier New" w:hAnsi="Courier New" w:cs="Courier New"/>
+                <w:sz w:val="20"/>
+                <w:szCs w:val="20"/>
+                <w:lang w:val="uk-UA"/>
+              </w:rPr>
+            </w:pPr>
+            <w:r>
+              <w:rPr>
+                <w:rFonts w:ascii="Courier New" w:hAnsi="Courier New" w:cs="Courier New"/>
+                <w:sz w:val="20"/>
+                <w:szCs w:val="20"/>
+                <w:lang w:val="uk-UA"/>
+              </w:rPr>
               <w:t xml:space="preserve">    </w:t>
             </w:r>
             <w:proofErr w:type="spellStart"/>
@@ -6892,6 +6925,7 @@
                 <w:szCs w:val="20"/>
                 <w:lang w:val="uk-UA"/>
               </w:rPr>
+              <w:lastRenderedPageBreak/>
               <w:t xml:space="preserve">if </w:t>
             </w:r>
             <w:proofErr w:type="spellStart"/>
@@ -6993,7 +7027,6 @@
                 <w:szCs w:val="20"/>
                 <w:lang w:val="uk-UA"/>
               </w:rPr>
-              <w:lastRenderedPageBreak/>
               <w:t>elif</w:t>
             </w:r>
             <w:proofErr w:type="spellEnd"/>
@@ -7642,17 +7675,9 @@
             <w:szCs w:val="24"/>
             <w:lang w:val="uk-UA"/>
           </w:rPr>
-          <w:t>2</w:t>
+          <w:t>2.</w:t>
         </w:r>
-        <w:r>
-          <w:rPr>
-            <w:rStyle w:val="a5"/>
-            <w:sz w:val="24"/>
-            <w:szCs w:val="24"/>
-            <w:lang w:val="uk-UA"/>
-          </w:rPr>
-          <w:t>.</w:t>
-        </w:r>
+        <w:proofErr w:type="spellStart"/>
         <w:r>
           <w:rPr>
             <w:rStyle w:val="a5"/>
@@ -7662,6 +7687,7 @@
           </w:rPr>
           <w:t>py</w:t>
         </w:r>
+        <w:proofErr w:type="spellEnd"/>
       </w:hyperlink>
     </w:p>
     <w:p>
@@ -7705,6 +7731,7 @@
       </w:pPr>
       <w:r>
         <w:rPr>
+          <w:noProof/>
           <w:lang w:val="ru-RU"/>
         </w:rPr>
         <w:drawing>
@@ -8624,6 +8651,66 @@
                 <w:szCs w:val="20"/>
                 <w:lang w:val="uk-UA"/>
               </w:rPr>
+              <w:t xml:space="preserve">    if b == 0:</w:t>
+            </w:r>
+          </w:p>
+          <w:p>
+            <w:pPr>
+              <w:ind w:firstLine="0"/>
+              <w:rPr>
+                <w:rFonts w:ascii="Courier New" w:hAnsi="Courier New" w:cs="Courier New"/>
+                <w:sz w:val="20"/>
+                <w:szCs w:val="20"/>
+                <w:lang w:val="uk-UA"/>
+              </w:rPr>
+            </w:pPr>
+            <w:r>
+              <w:rPr>
+                <w:rFonts w:ascii="Courier New" w:hAnsi="Courier New" w:cs="Courier New"/>
+                <w:sz w:val="20"/>
+                <w:szCs w:val="20"/>
+                <w:lang w:val="uk-UA"/>
+              </w:rPr>
+              <w:t xml:space="preserve">        </w:t>
+            </w:r>
+            <w:proofErr w:type="spellStart"/>
+            <w:r>
+              <w:rPr>
+                <w:rFonts w:ascii="Courier New" w:hAnsi="Courier New" w:cs="Courier New"/>
+                <w:sz w:val="20"/>
+                <w:szCs w:val="20"/>
+                <w:lang w:val="uk-UA"/>
+              </w:rPr>
+              <w:t>return</w:t>
+            </w:r>
+            <w:proofErr w:type="spellEnd"/>
+            <w:r>
+              <w:rPr>
+                <w:rFonts w:ascii="Courier New" w:hAnsi="Courier New" w:cs="Courier New"/>
+                <w:sz w:val="20"/>
+                <w:szCs w:val="20"/>
+                <w:lang w:val="uk-UA"/>
+              </w:rPr>
+              <w:t xml:space="preserve"> "Помилка: ділення на нуль неможливе!"</w:t>
+            </w:r>
+          </w:p>
+          <w:p>
+            <w:pPr>
+              <w:ind w:firstLine="0"/>
+              <w:rPr>
+                <w:rFonts w:ascii="Courier New" w:hAnsi="Courier New" w:cs="Courier New"/>
+                <w:sz w:val="20"/>
+                <w:szCs w:val="20"/>
+                <w:lang w:val="uk-UA"/>
+              </w:rPr>
+            </w:pPr>
+            <w:r>
+              <w:rPr>
+                <w:rFonts w:ascii="Courier New" w:hAnsi="Courier New" w:cs="Courier New"/>
+                <w:sz w:val="20"/>
+                <w:szCs w:val="20"/>
+                <w:lang w:val="uk-UA"/>
+              </w:rPr>
               <w:t xml:space="preserve">    </w:t>
             </w:r>
             <w:proofErr w:type="spellStart"/>
@@ -8675,6 +8762,7 @@
                 <w:szCs w:val="20"/>
                 <w:lang w:val="uk-UA"/>
               </w:rPr>
+              <w:lastRenderedPageBreak/>
               <w:t xml:space="preserve">a = </w:t>
             </w:r>
             <w:proofErr w:type="spellStart"/>
@@ -8796,7 +8884,6 @@
                 <w:szCs w:val="20"/>
                 <w:lang w:val="uk-UA"/>
               </w:rPr>
-              <w:lastRenderedPageBreak/>
               <w:t>oper</w:t>
             </w:r>
             <w:proofErr w:type="spellEnd"/>
@@ -9634,17 +9721,9 @@
             <w:szCs w:val="24"/>
             <w:lang w:val="uk-UA"/>
           </w:rPr>
-          <w:t>3</w:t>
+          <w:t>3.</w:t>
         </w:r>
-        <w:r>
-          <w:rPr>
-            <w:rStyle w:val="a5"/>
-            <w:sz w:val="24"/>
-            <w:szCs w:val="24"/>
-            <w:lang w:val="uk-UA"/>
-          </w:rPr>
-          <w:t>.</w:t>
-        </w:r>
+        <w:proofErr w:type="spellStart"/>
         <w:r>
           <w:rPr>
             <w:rStyle w:val="a5"/>
@@ -9654,6 +9733,7 @@
           </w:rPr>
           <w:t>py</w:t>
         </w:r>
+        <w:proofErr w:type="spellEnd"/>
       </w:hyperlink>
     </w:p>
     <w:p>
@@ -9697,6 +9777,7 @@
       </w:pPr>
       <w:r>
         <w:rPr>
+          <w:noProof/>
           <w:lang w:val="ru-RU"/>
         </w:rPr>
         <w:drawing>
@@ -9785,19 +9866,8 @@
         <w:rPr>
           <w:lang w:val="uk-UA"/>
         </w:rPr>
-        <w:t>Під час виконання практичного завдання до Теми №</w:t>
-      </w:r>
-      <w:r>
-        <w:rPr>
-          <w:lang w:val="uk-UA"/>
-        </w:rPr>
-        <w:t>3</w:t>
-      </w:r>
-      <w:r>
-        <w:rPr>
-          <w:lang w:val="uk-UA"/>
-        </w:rPr>
-        <w:t xml:space="preserve"> було надано варіанти рішення до наступних задач:</w:t>
+        <w:lastRenderedPageBreak/>
+        <w:t>Під час виконання практичного завдання до Теми №3 було надано варіанти рішення до наступних задач:</w:t>
       </w:r>
     </w:p>
     <w:p>
@@ -9814,16 +9884,7 @@
           <w:bCs/>
           <w:lang w:val="uk-UA"/>
         </w:rPr>
-        <w:lastRenderedPageBreak/>
-        <w:t xml:space="preserve">1. </w:t>
-      </w:r>
-      <w:r>
-        <w:rPr>
-          <w:b/>
-          <w:bCs/>
-          <w:lang w:val="uk-UA"/>
-        </w:rPr>
-        <w:t>Постійний калькулятор</w:t>
+        <w:t>1. Постійний калькулятор</w:t>
       </w:r>
     </w:p>
     <w:p>
@@ -10232,6 +10293,7 @@
         <w:rPr>
           <w:lang w:val="uk-UA"/>
         </w:rPr>
+        <w:lastRenderedPageBreak/>
         <w:t xml:space="preserve">Реалізуємо умову if q == "n": з інструкцією </w:t>
       </w:r>
       <w:proofErr w:type="spellStart"/>
@@ -10265,7 +10327,6 @@
         <w:rPr>
           <w:lang w:val="uk-UA"/>
         </w:rPr>
-        <w:lastRenderedPageBreak/>
         <w:t>Тестуємо роботу програми в циклі: перевіряємо багаторазові обчислення та зупинку роботи при введенні команди завершення.</w:t>
       </w:r>
     </w:p>
@@ -10672,6 +10733,66 @@
                 <w:szCs w:val="20"/>
                 <w:lang w:val="uk-UA"/>
               </w:rPr>
+              <w:t xml:space="preserve">    if b == 0:</w:t>
+            </w:r>
+          </w:p>
+          <w:p>
+            <w:pPr>
+              <w:ind w:firstLine="0"/>
+              <w:rPr>
+                <w:rFonts w:ascii="Courier New" w:hAnsi="Courier New" w:cs="Courier New"/>
+                <w:sz w:val="20"/>
+                <w:szCs w:val="20"/>
+                <w:lang w:val="uk-UA"/>
+              </w:rPr>
+            </w:pPr>
+            <w:r>
+              <w:rPr>
+                <w:rFonts w:ascii="Courier New" w:hAnsi="Courier New" w:cs="Courier New"/>
+                <w:sz w:val="20"/>
+                <w:szCs w:val="20"/>
+                <w:lang w:val="uk-UA"/>
+              </w:rPr>
+              <w:t xml:space="preserve">        </w:t>
+            </w:r>
+            <w:proofErr w:type="spellStart"/>
+            <w:r>
+              <w:rPr>
+                <w:rFonts w:ascii="Courier New" w:hAnsi="Courier New" w:cs="Courier New"/>
+                <w:sz w:val="20"/>
+                <w:szCs w:val="20"/>
+                <w:lang w:val="uk-UA"/>
+              </w:rPr>
+              <w:t>return</w:t>
+            </w:r>
+            <w:proofErr w:type="spellEnd"/>
+            <w:r>
+              <w:rPr>
+                <w:rFonts w:ascii="Courier New" w:hAnsi="Courier New" w:cs="Courier New"/>
+                <w:sz w:val="20"/>
+                <w:szCs w:val="20"/>
+                <w:lang w:val="uk-UA"/>
+              </w:rPr>
+              <w:t xml:space="preserve"> "Помилка: ділення на нуль неможливе!"</w:t>
+            </w:r>
+          </w:p>
+          <w:p>
+            <w:pPr>
+              <w:ind w:firstLine="0"/>
+              <w:rPr>
+                <w:rFonts w:ascii="Courier New" w:hAnsi="Courier New" w:cs="Courier New"/>
+                <w:sz w:val="20"/>
+                <w:szCs w:val="20"/>
+                <w:lang w:val="uk-UA"/>
+              </w:rPr>
+            </w:pPr>
+            <w:r>
+              <w:rPr>
+                <w:rFonts w:ascii="Courier New" w:hAnsi="Courier New" w:cs="Courier New"/>
+                <w:sz w:val="20"/>
+                <w:szCs w:val="20"/>
+                <w:lang w:val="uk-UA"/>
+              </w:rPr>
               <w:t xml:space="preserve">    </w:t>
             </w:r>
             <w:proofErr w:type="spellStart"/>
@@ -11074,27 +11195,7 @@
                 <w:szCs w:val="20"/>
                 <w:lang w:val="uk-UA"/>
               </w:rPr>
-              <w:t xml:space="preserve"> </w:t>
-            </w:r>
-            <w:proofErr w:type="spellStart"/>
-            <w:r>
-              <w:rPr>
-                <w:rFonts w:ascii="Courier New" w:hAnsi="Courier New" w:cs="Courier New"/>
-                <w:sz w:val="20"/>
-                <w:szCs w:val="20"/>
-                <w:lang w:val="uk-UA"/>
-              </w:rPr>
-              <w:t>oper</w:t>
-            </w:r>
-            <w:proofErr w:type="spellEnd"/>
-            <w:r>
-              <w:rPr>
-                <w:rFonts w:ascii="Courier New" w:hAnsi="Courier New" w:cs="Courier New"/>
-                <w:sz w:val="20"/>
-                <w:szCs w:val="20"/>
-                <w:lang w:val="uk-UA"/>
-              </w:rPr>
-              <w:t xml:space="preserve"> == "-":</w:t>
+              <w:t xml:space="preserve"> oper == "-":</w:t>
             </w:r>
           </w:p>
           <w:p>
@@ -11194,27 +11295,7 @@
                 <w:szCs w:val="20"/>
                 <w:lang w:val="uk-UA"/>
               </w:rPr>
-              <w:t xml:space="preserve"> </w:t>
-            </w:r>
-            <w:proofErr w:type="spellStart"/>
-            <w:r>
-              <w:rPr>
-                <w:rFonts w:ascii="Courier New" w:hAnsi="Courier New" w:cs="Courier New"/>
-                <w:sz w:val="20"/>
-                <w:szCs w:val="20"/>
-                <w:lang w:val="uk-UA"/>
-              </w:rPr>
-              <w:t>oper</w:t>
-            </w:r>
-            <w:proofErr w:type="spellEnd"/>
-            <w:r>
-              <w:rPr>
-                <w:rFonts w:ascii="Courier New" w:hAnsi="Courier New" w:cs="Courier New"/>
-                <w:sz w:val="20"/>
-                <w:szCs w:val="20"/>
-                <w:lang w:val="uk-UA"/>
-              </w:rPr>
-              <w:t xml:space="preserve"> == "*":</w:t>
+              <w:t xml:space="preserve"> oper == "*":</w:t>
             </w:r>
           </w:p>
           <w:p>
@@ -11314,27 +11395,7 @@
                 <w:szCs w:val="20"/>
                 <w:lang w:val="uk-UA"/>
               </w:rPr>
-              <w:t xml:space="preserve"> </w:t>
-            </w:r>
-            <w:proofErr w:type="spellStart"/>
-            <w:r>
-              <w:rPr>
-                <w:rFonts w:ascii="Courier New" w:hAnsi="Courier New" w:cs="Courier New"/>
-                <w:sz w:val="20"/>
-                <w:szCs w:val="20"/>
-                <w:lang w:val="uk-UA"/>
-              </w:rPr>
-              <w:t>oper</w:t>
-            </w:r>
-            <w:proofErr w:type="spellEnd"/>
-            <w:r>
-              <w:rPr>
-                <w:rFonts w:ascii="Courier New" w:hAnsi="Courier New" w:cs="Courier New"/>
-                <w:sz w:val="20"/>
-                <w:szCs w:val="20"/>
-                <w:lang w:val="uk-UA"/>
-              </w:rPr>
-              <w:t xml:space="preserve"> == "/":</w:t>
+              <w:t xml:space="preserve"> oper == "/":</w:t>
             </w:r>
           </w:p>
           <w:p>
@@ -11658,7 +11719,6 @@
         <w:rPr>
           <w:lang w:val="uk-UA"/>
         </w:rPr>
-        <w:lastRenderedPageBreak/>
         <w:tab/>
         <w:t xml:space="preserve">Посилання на </w:t>
       </w:r>
@@ -11677,6 +11737,9 @@
     <w:p>
       <w:pPr>
         <w:ind w:firstLine="0"/>
+        <w:rPr>
+          <w:lang w:val="ru-RU"/>
+        </w:rPr>
       </w:pPr>
       <w:r>
         <w:rPr>
@@ -11883,25 +11946,7 @@
             <w:szCs w:val="24"/>
             <w:lang w:val="uk-UA"/>
           </w:rPr>
-          <w:t>_0</w:t>
-        </w:r>
-        <w:r>
-          <w:rPr>
-            <w:rStyle w:val="a5"/>
-            <w:sz w:val="24"/>
-            <w:szCs w:val="24"/>
-            <w:lang w:val="uk-UA"/>
-          </w:rPr>
-          <w:t>3</w:t>
-        </w:r>
-        <w:r>
-          <w:rPr>
-            <w:rStyle w:val="a5"/>
-            <w:sz w:val="24"/>
-            <w:szCs w:val="24"/>
-            <w:lang w:val="uk-UA"/>
-          </w:rPr>
-          <w:t>/</w:t>
+          <w:t>_03/</w:t>
         </w:r>
         <w:r>
           <w:rPr>
@@ -11919,17 +11964,9 @@
             <w:szCs w:val="24"/>
             <w:lang w:val="uk-UA"/>
           </w:rPr>
-          <w:t>1</w:t>
+          <w:t>1.</w:t>
         </w:r>
-        <w:r>
-          <w:rPr>
-            <w:rStyle w:val="a5"/>
-            <w:sz w:val="24"/>
-            <w:szCs w:val="24"/>
-            <w:lang w:val="uk-UA"/>
-          </w:rPr>
-          <w:t>.</w:t>
-        </w:r>
+        <w:proofErr w:type="spellStart"/>
         <w:r>
           <w:rPr>
             <w:rStyle w:val="a5"/>
@@ -11939,6 +11976,7 @@
           </w:rPr>
           <w:t>py</w:t>
         </w:r>
+        <w:proofErr w:type="spellEnd"/>
       </w:hyperlink>
     </w:p>
     <w:p>
@@ -11978,6 +12016,9 @@
         <w:jc w:val="center"/>
       </w:pPr>
       <w:r>
+        <w:rPr>
+          <w:noProof/>
+        </w:rPr>
         <w:drawing>
           <wp:inline distT="0" distB="0" distL="0" distR="0" wp14:anchorId="38262C35" wp14:editId="2B7AB290">
             <wp:extent cx="2695951" cy="2219635"/>
@@ -12029,23 +12070,7 @@
           <w:bCs/>
           <w:lang w:val="uk-UA"/>
         </w:rPr>
-        <w:t>2</w:t>
-      </w:r>
-      <w:r>
-        <w:rPr>
-          <w:b/>
-          <w:bCs/>
-          <w:lang w:val="uk-UA"/>
-        </w:rPr>
-        <w:t xml:space="preserve">. </w:t>
-      </w:r>
-      <w:r>
-        <w:rPr>
-          <w:b/>
-          <w:bCs/>
-          <w:lang w:val="uk-UA"/>
-        </w:rPr>
-        <w:t>Тест функцій списків</w:t>
+        <w:t>2. Тест функцій списків</w:t>
       </w:r>
     </w:p>
     <w:p>
@@ -12331,6 +12356,7 @@
         <w:rPr>
           <w:lang w:val="uk-UA"/>
         </w:rPr>
+        <w:lastRenderedPageBreak/>
         <w:t xml:space="preserve">Використовуємо метод </w:t>
       </w:r>
       <w:proofErr w:type="spellStart"/>
@@ -12430,7 +12456,6 @@
         <w:rPr>
           <w:lang w:val="uk-UA"/>
         </w:rPr>
-        <w:lastRenderedPageBreak/>
         <w:t xml:space="preserve">Створюємо незалежну поверхневу копію списку за допомогою методу </w:t>
       </w:r>
       <w:proofErr w:type="spellStart"/>
@@ -13253,6 +13278,7 @@
                 <w:szCs w:val="20"/>
                 <w:lang w:val="uk-UA"/>
               </w:rPr>
+              <w:lastRenderedPageBreak/>
               <w:t>copied_list</w:t>
             </w:r>
             <w:proofErr w:type="spellEnd"/>
@@ -13672,7 +13698,6 @@
                 <w:szCs w:val="20"/>
                 <w:lang w:val="uk-UA"/>
               </w:rPr>
-              <w:lastRenderedPageBreak/>
               <w:t>numbers.clear</w:t>
             </w:r>
             <w:proofErr w:type="spellEnd"/>
@@ -13814,8 +13839,14 @@
     <w:p>
       <w:pPr>
         <w:ind w:firstLine="0"/>
-      </w:pPr>
-      <w:r>
+        <w:rPr>
+          <w:lang w:val="ru-RU"/>
+        </w:rPr>
+      </w:pPr>
+      <w:r>
+        <w:rPr>
+          <w:lang w:val="ru-RU"/>
+        </w:rPr>
         <w:tab/>
       </w:r>
       <w:hyperlink r:id="rId19" w:history="1">
@@ -13836,6 +13867,7 @@
           </w:rPr>
           <w:t>://</w:t>
         </w:r>
+        <w:proofErr w:type="spellStart"/>
         <w:r>
           <w:rPr>
             <w:rStyle w:val="a5"/>
@@ -13844,6 +13876,7 @@
           </w:rPr>
           <w:t>github</w:t>
         </w:r>
+        <w:proofErr w:type="spellEnd"/>
         <w:r>
           <w:rPr>
             <w:rStyle w:val="a5"/>
@@ -13870,6 +13903,7 @@
           </w:rPr>
           <w:t>/</w:t>
         </w:r>
+        <w:proofErr w:type="spellStart"/>
         <w:r>
           <w:rPr>
             <w:rStyle w:val="a5"/>
@@ -13878,6 +13912,7 @@
           </w:rPr>
           <w:t>prokh</w:t>
         </w:r>
+        <w:proofErr w:type="spellEnd"/>
         <w:r>
           <w:rPr>
             <w:rStyle w:val="a5"/>
@@ -13938,6 +13973,7 @@
           </w:rPr>
           <w:t>-</w:t>
         </w:r>
+        <w:proofErr w:type="spellStart"/>
         <w:r>
           <w:rPr>
             <w:rStyle w:val="a5"/>
@@ -13946,6 +13982,7 @@
           </w:rPr>
           <w:t>Prokhorenko</w:t>
         </w:r>
+        <w:proofErr w:type="spellEnd"/>
         <w:r>
           <w:rPr>
             <w:rStyle w:val="a5"/>
@@ -14019,6 +14056,7 @@
             <w:rStyle w:val="a5"/>
             <w:sz w:val="24"/>
             <w:szCs w:val="24"/>
+            <w:lang w:val="ru-RU"/>
           </w:rPr>
           <w:t>2</w:t>
         </w:r>
@@ -14031,6 +14069,7 @@
           </w:rPr>
           <w:t>.</w:t>
         </w:r>
+        <w:proofErr w:type="spellStart"/>
         <w:r>
           <w:rPr>
             <w:rStyle w:val="a5"/>
@@ -14039,6 +14078,7 @@
           </w:rPr>
           <w:t>py</w:t>
         </w:r>
+        <w:proofErr w:type="spellEnd"/>
       </w:hyperlink>
     </w:p>
     <w:p>
@@ -14049,6 +14089,9 @@
         </w:rPr>
       </w:pPr>
       <w:r>
+        <w:rPr>
+          <w:lang w:val="ru-RU"/>
+        </w:rPr>
         <w:tab/>
       </w:r>
       <w:r>
@@ -14079,6 +14122,7 @@
       </w:pPr>
       <w:r>
         <w:rPr>
+          <w:noProof/>
           <w:lang w:val="ru-RU"/>
         </w:rPr>
         <w:drawing>
@@ -14132,23 +14176,7 @@
           <w:bCs/>
           <w:lang w:val="uk-UA"/>
         </w:rPr>
-        <w:t>3</w:t>
-      </w:r>
-      <w:r>
-        <w:rPr>
-          <w:b/>
-          <w:bCs/>
-          <w:lang w:val="uk-UA"/>
-        </w:rPr>
-        <w:t xml:space="preserve">. </w:t>
-      </w:r>
-      <w:r>
-        <w:rPr>
-          <w:b/>
-          <w:bCs/>
-          <w:lang w:val="uk-UA"/>
-        </w:rPr>
-        <w:t>Тест функцій словників</w:t>
+        <w:t>3. Тест функцій словників</w:t>
       </w:r>
     </w:p>
     <w:p>
@@ -14290,6 +14318,7 @@
         <w:rPr>
           <w:lang w:val="uk-UA"/>
         </w:rPr>
+        <w:lastRenderedPageBreak/>
         <w:t xml:space="preserve">Створюємо вихідний словник </w:t>
       </w:r>
       <w:proofErr w:type="spellStart"/>
@@ -14445,7 +14474,6 @@
         <w:rPr>
           <w:lang w:val="uk-UA"/>
         </w:rPr>
-        <w:lastRenderedPageBreak/>
         <w:t xml:space="preserve">Демонструємо роботу методу </w:t>
       </w:r>
       <w:proofErr w:type="spellStart"/>
@@ -15780,7 +15808,6 @@
         <w:rPr>
           <w:lang w:val="uk-UA"/>
         </w:rPr>
-        <w:lastRenderedPageBreak/>
         <w:tab/>
         <w:t xml:space="preserve">Посилання на </w:t>
       </w:r>
@@ -15799,8 +15826,14 @@
     <w:p>
       <w:pPr>
         <w:ind w:firstLine="0"/>
-      </w:pPr>
-      <w:r>
+        <w:rPr>
+          <w:lang w:val="ru-RU"/>
+        </w:rPr>
+      </w:pPr>
+      <w:r>
+        <w:rPr>
+          <w:lang w:val="ru-RU"/>
+        </w:rPr>
         <w:tab/>
       </w:r>
       <w:hyperlink r:id="rId21" w:history="1">
@@ -15821,6 +15854,7 @@
           </w:rPr>
           <w:t>://</w:t>
         </w:r>
+        <w:proofErr w:type="spellStart"/>
         <w:r>
           <w:rPr>
             <w:rStyle w:val="a5"/>
@@ -15829,6 +15863,7 @@
           </w:rPr>
           <w:t>github</w:t>
         </w:r>
+        <w:proofErr w:type="spellEnd"/>
         <w:r>
           <w:rPr>
             <w:rStyle w:val="a5"/>
@@ -15855,6 +15890,7 @@
           </w:rPr>
           <w:t>/</w:t>
         </w:r>
+        <w:proofErr w:type="spellStart"/>
         <w:r>
           <w:rPr>
             <w:rStyle w:val="a5"/>
@@ -15863,6 +15899,7 @@
           </w:rPr>
           <w:t>prokh</w:t>
         </w:r>
+        <w:proofErr w:type="spellEnd"/>
         <w:r>
           <w:rPr>
             <w:rStyle w:val="a5"/>
@@ -15923,6 +15960,7 @@
           </w:rPr>
           <w:t>-</w:t>
         </w:r>
+        <w:proofErr w:type="spellStart"/>
         <w:r>
           <w:rPr>
             <w:rStyle w:val="a5"/>
@@ -15931,6 +15969,7 @@
           </w:rPr>
           <w:t>Prokhorenko</w:t>
         </w:r>
+        <w:proofErr w:type="spellEnd"/>
         <w:r>
           <w:rPr>
             <w:rStyle w:val="a5"/>
@@ -16004,6 +16043,7 @@
             <w:rStyle w:val="a5"/>
             <w:sz w:val="24"/>
             <w:szCs w:val="24"/>
+            <w:lang w:val="ru-RU"/>
           </w:rPr>
           <w:t>3</w:t>
         </w:r>
@@ -16016,6 +16056,7 @@
           </w:rPr>
           <w:t>.</w:t>
         </w:r>
+        <w:proofErr w:type="spellStart"/>
         <w:r>
           <w:rPr>
             <w:rStyle w:val="a5"/>
@@ -16024,6 +16065,7 @@
           </w:rPr>
           <w:t>py</w:t>
         </w:r>
+        <w:proofErr w:type="spellEnd"/>
       </w:hyperlink>
     </w:p>
     <w:p>
@@ -16034,6 +16076,9 @@
         </w:rPr>
       </w:pPr>
       <w:r>
+        <w:rPr>
+          <w:lang w:val="ru-RU"/>
+        </w:rPr>
         <w:tab/>
       </w:r>
       <w:r>
@@ -16064,6 +16109,7 @@
       </w:pPr>
       <w:r>
         <w:rPr>
+          <w:noProof/>
           <w:lang w:val="ru-RU"/>
         </w:rPr>
         <w:drawing>
@@ -16117,23 +16163,7 @@
           <w:bCs/>
           <w:lang w:val="uk-UA"/>
         </w:rPr>
-        <w:t>4</w:t>
-      </w:r>
-      <w:r>
-        <w:rPr>
-          <w:b/>
-          <w:bCs/>
-          <w:lang w:val="uk-UA"/>
-        </w:rPr>
-        <w:t xml:space="preserve">. </w:t>
-      </w:r>
-      <w:r>
-        <w:rPr>
-          <w:b/>
-          <w:bCs/>
-          <w:lang w:val="uk-UA"/>
-        </w:rPr>
-        <w:t>Функція пошуку позиції в списку</w:t>
+        <w:t>4. Функція пошуку позиції в списку</w:t>
       </w:r>
     </w:p>
     <w:p>
@@ -16246,6 +16276,7 @@
         <w:rPr>
           <w:lang w:val="uk-UA"/>
         </w:rPr>
+        <w:lastRenderedPageBreak/>
         <w:t xml:space="preserve">За допомогою циклу </w:t>
       </w:r>
       <w:proofErr w:type="spellStart"/>
@@ -16472,7 +16503,6 @@
         <w:rPr>
           <w:lang w:val="uk-UA"/>
         </w:rPr>
-        <w:lastRenderedPageBreak/>
         <w:t>Ініціалізуємо</w:t>
       </w:r>
       <w:proofErr w:type="spellEnd"/>
@@ -16943,27 +16973,7 @@
                 <w:szCs w:val="20"/>
                 <w:lang w:val="uk-UA"/>
               </w:rPr>
-              <w:t xml:space="preserve"> &gt;= </w:t>
-            </w:r>
-            <w:proofErr w:type="spellStart"/>
-            <w:r>
-              <w:rPr>
-                <w:rFonts w:ascii="Courier New" w:hAnsi="Courier New" w:cs="Courier New"/>
-                <w:sz w:val="20"/>
-                <w:szCs w:val="20"/>
-                <w:lang w:val="uk-UA"/>
-              </w:rPr>
-              <w:t>item</w:t>
-            </w:r>
-            <w:proofErr w:type="spellEnd"/>
-            <w:r>
-              <w:rPr>
-                <w:rFonts w:ascii="Courier New" w:hAnsi="Courier New" w:cs="Courier New"/>
-                <w:sz w:val="20"/>
-                <w:szCs w:val="20"/>
-                <w:lang w:val="uk-UA"/>
-              </w:rPr>
-              <w:t>:</w:t>
+              <w:t xml:space="preserve"> &gt;= item:</w:t>
             </w:r>
           </w:p>
           <w:p>
@@ -17646,8 +17656,14 @@
     <w:p>
       <w:pPr>
         <w:ind w:firstLine="0"/>
-      </w:pPr>
-      <w:r>
+        <w:rPr>
+          <w:lang w:val="ru-RU"/>
+        </w:rPr>
+      </w:pPr>
+      <w:r>
+        <w:rPr>
+          <w:lang w:val="ru-RU"/>
+        </w:rPr>
         <w:tab/>
       </w:r>
       <w:hyperlink r:id="rId23" w:history="1">
@@ -17668,6 +17684,7 @@
           </w:rPr>
           <w:t>://</w:t>
         </w:r>
+        <w:proofErr w:type="spellStart"/>
         <w:r>
           <w:rPr>
             <w:rStyle w:val="a5"/>
@@ -17676,6 +17693,7 @@
           </w:rPr>
           <w:t>github</w:t>
         </w:r>
+        <w:proofErr w:type="spellEnd"/>
         <w:r>
           <w:rPr>
             <w:rStyle w:val="a5"/>
@@ -17702,6 +17720,7 @@
           </w:rPr>
           <w:t>/</w:t>
         </w:r>
+        <w:proofErr w:type="spellStart"/>
         <w:r>
           <w:rPr>
             <w:rStyle w:val="a5"/>
@@ -17710,6 +17729,7 @@
           </w:rPr>
           <w:t>prokh</w:t>
         </w:r>
+        <w:proofErr w:type="spellEnd"/>
         <w:r>
           <w:rPr>
             <w:rStyle w:val="a5"/>
@@ -17770,6 +17790,7 @@
           </w:rPr>
           <w:t>-</w:t>
         </w:r>
+        <w:proofErr w:type="spellStart"/>
         <w:r>
           <w:rPr>
             <w:rStyle w:val="a5"/>
@@ -17778,6 +17799,7 @@
           </w:rPr>
           <w:t>Prokhorenko</w:t>
         </w:r>
+        <w:proofErr w:type="spellEnd"/>
         <w:r>
           <w:rPr>
             <w:rStyle w:val="a5"/>
@@ -17851,6 +17873,7 @@
             <w:rStyle w:val="a5"/>
             <w:sz w:val="24"/>
             <w:szCs w:val="24"/>
+            <w:lang w:val="ru-RU"/>
           </w:rPr>
           <w:t>4</w:t>
         </w:r>
@@ -17863,6 +17886,7 @@
           </w:rPr>
           <w:t>.</w:t>
         </w:r>
+        <w:proofErr w:type="spellStart"/>
         <w:r>
           <w:rPr>
             <w:rStyle w:val="a5"/>
@@ -17871,6 +17895,7 @@
           </w:rPr>
           <w:t>py</w:t>
         </w:r>
+        <w:proofErr w:type="spellEnd"/>
       </w:hyperlink>
     </w:p>
     <w:p>
@@ -17881,7 +17906,9 @@
         </w:rPr>
       </w:pPr>
       <w:r>
-        <w:lastRenderedPageBreak/>
+        <w:rPr>
+          <w:lang w:val="ru-RU"/>
+        </w:rPr>
         <w:tab/>
       </w:r>
       <w:r>
@@ -17908,6 +17935,9 @@
         <w:jc w:val="center"/>
       </w:pPr>
       <w:r>
+        <w:rPr>
+          <w:noProof/>
+        </w:rPr>
         <w:drawing>
           <wp:inline distT="0" distB="0" distL="0" distR="0" wp14:anchorId="044E1C3E" wp14:editId="439E2893">
             <wp:extent cx="3658111" cy="1086002"/>
@@ -20374,6 +20404,7 @@
   <w:style w:type="character" w:default="1" w:styleId="a0">
     <w:name w:val="Default Paragraph Font"/>
     <w:uiPriority w:val="1"/>
+    <w:semiHidden/>
     <w:unhideWhenUsed/>
   </w:style>
   <w:style w:type="table" w:default="1" w:styleId="a1">

</xml_diff>